<commit_message>
Preserve PG metric audit, compiled manuscripts and partial delivery
</commit_message>
<xml_diff>
--- a/research/pg_information_control_frontier/deliverables/YCS_PG_Information_Control_Frontier_v1.0_PARTIAL/01_EXECUTIVE_SUMMARY.docx
+++ b/research/pg_information_control_frontier/deliverables/YCS_PG_Information_Control_Frontier_v1.0_PARTIAL/01_EXECUTIVE_SUMMARY.docx
@@ -193,79 +193,79 @@
               <w:jc w:val="left"/>
             </w:pPr>
             <w:r>
-              <w:t xml:space="preserve">candidate</w:t>
-            </w:r>
-          </w:p>
-        </w:tc>
-        <w:tc>
-          <w:tcPr/>
-          <w:p>
-            <w:pPr>
-              <w:pStyle w:val="Compact"/>
-              <w:jc w:val="left"/>
-            </w:pPr>
-            <w:r>
-              <w:t xml:space="preserve">baseline</w:t>
-            </w:r>
-          </w:p>
-        </w:tc>
-        <w:tc>
-          <w:tcPr/>
-          <w:p>
-            <w:pPr>
-              <w:pStyle w:val="Compact"/>
-              <w:jc w:val="left"/>
-            </w:pPr>
-            <w:r>
-              <w:t xml:space="preserve">percent_improvement</w:t>
-            </w:r>
-          </w:p>
-        </w:tc>
-        <w:tc>
-          <w:tcPr/>
-          <w:p>
-            <w:pPr>
-              <w:pStyle w:val="Compact"/>
-              <w:jc w:val="left"/>
-            </w:pPr>
-            <w:r>
-              <w:t xml:space="preserve">mean_improvement</w:t>
-            </w:r>
-          </w:p>
-        </w:tc>
-        <w:tc>
-          <w:tcPr/>
-          <w:p>
-            <w:pPr>
-              <w:pStyle w:val="Compact"/>
-              <w:jc w:val="left"/>
-            </w:pPr>
-            <w:r>
-              <w:t xml:space="preserve">ci95_low</w:t>
-            </w:r>
-          </w:p>
-        </w:tc>
-        <w:tc>
-          <w:tcPr/>
-          <w:p>
-            <w:pPr>
-              <w:pStyle w:val="Compact"/>
-              <w:jc w:val="left"/>
-            </w:pPr>
-            <w:r>
-              <w:t xml:space="preserve">ci95_high</w:t>
-            </w:r>
-          </w:p>
-        </w:tc>
-        <w:tc>
-          <w:tcPr/>
-          <w:p>
-            <w:pPr>
-              <w:pStyle w:val="Compact"/>
-              <w:jc w:val="left"/>
-            </w:pPr>
-            <w:r>
-              <w:t xml:space="preserve">p_holm_primary</w:t>
+              <w:t xml:space="preserve">Candidate</w:t>
+            </w:r>
+          </w:p>
+        </w:tc>
+        <w:tc>
+          <w:tcPr/>
+          <w:p>
+            <w:pPr>
+              <w:pStyle w:val="Compact"/>
+              <w:jc w:val="left"/>
+            </w:pPr>
+            <w:r>
+              <w:t xml:space="preserve">Baseline</w:t>
+            </w:r>
+          </w:p>
+        </w:tc>
+        <w:tc>
+          <w:tcPr/>
+          <w:p>
+            <w:pPr>
+              <w:pStyle w:val="Compact"/>
+              <w:jc w:val="left"/>
+            </w:pPr>
+            <w:r>
+              <w:t xml:space="preserve">Gain (%)</w:t>
+            </w:r>
+          </w:p>
+        </w:tc>
+        <w:tc>
+          <w:tcPr/>
+          <w:p>
+            <w:pPr>
+              <w:pStyle w:val="Compact"/>
+              <w:jc w:val="left"/>
+            </w:pPr>
+            <w:r>
+              <w:t xml:space="preserve">IAE diff.</w:t>
+            </w:r>
+          </w:p>
+        </w:tc>
+        <w:tc>
+          <w:tcPr/>
+          <w:p>
+            <w:pPr>
+              <w:pStyle w:val="Compact"/>
+              <w:jc w:val="left"/>
+            </w:pPr>
+            <w:r>
+              <w:t xml:space="preserve">CI lower</w:t>
+            </w:r>
+          </w:p>
+        </w:tc>
+        <w:tc>
+          <w:tcPr/>
+          <w:p>
+            <w:pPr>
+              <w:pStyle w:val="Compact"/>
+              <w:jc w:val="left"/>
+            </w:pPr>
+            <w:r>
+              <w:t xml:space="preserve">CI upper</w:t>
+            </w:r>
+          </w:p>
+        </w:tc>
+        <w:tc>
+          <w:tcPr/>
+          <w:p>
+            <w:pPr>
+              <w:pStyle w:val="Compact"/>
+              <w:jc w:val="left"/>
+            </w:pPr>
+            <w:r>
+              <w:t xml:space="preserve">Holm p</w:t>
             </w:r>
           </w:p>
         </w:tc>
@@ -279,79 +279,79 @@
               <w:jc w:val="left"/>
             </w:pPr>
             <w:r>
-              <w:t xml:space="preserve">P2_regret</w:t>
-            </w:r>
-          </w:p>
-        </w:tc>
-        <w:tc>
-          <w:tcPr/>
-          <w:p>
-            <w:pPr>
-              <w:pStyle w:val="Compact"/>
-              <w:jc w:val="left"/>
-            </w:pPr>
-            <w:r>
-              <w:t xml:space="preserve">B1_ukf</w:t>
-            </w:r>
-          </w:p>
-        </w:tc>
-        <w:tc>
-          <w:tcPr/>
-          <w:p>
-            <w:pPr>
-              <w:pStyle w:val="Compact"/>
-              <w:jc w:val="left"/>
-            </w:pPr>
-            <w:r>
-              <w:t xml:space="preserve">0.634593</w:t>
-            </w:r>
-          </w:p>
-        </w:tc>
-        <w:tc>
-          <w:tcPr/>
-          <w:p>
-            <w:pPr>
-              <w:pStyle w:val="Compact"/>
-              <w:jc w:val="left"/>
-            </w:pPr>
-            <w:r>
-              <w:t xml:space="preserve">0.000850102</w:t>
-            </w:r>
-          </w:p>
-        </w:tc>
-        <w:tc>
-          <w:tcPr/>
-          <w:p>
-            <w:pPr>
-              <w:pStyle w:val="Compact"/>
-              <w:jc w:val="left"/>
-            </w:pPr>
-            <w:r>
-              <w:t xml:space="preserve">-0.00100823</w:t>
-            </w:r>
-          </w:p>
-        </w:tc>
-        <w:tc>
-          <w:tcPr/>
-          <w:p>
-            <w:pPr>
-              <w:pStyle w:val="Compact"/>
-              <w:jc w:val="left"/>
-            </w:pPr>
-            <w:r>
-              <w:t xml:space="preserve">0.00283537</w:t>
-            </w:r>
-          </w:p>
-        </w:tc>
-        <w:tc>
-          <w:tcPr/>
-          <w:p>
-            <w:pPr>
-              <w:pStyle w:val="Compact"/>
-              <w:jc w:val="left"/>
-            </w:pPr>
-            <w:r>
-              <w:t xml:space="preserve">0.418569</w:t>
+              <w:t xml:space="preserve">P2 regret</w:t>
+            </w:r>
+          </w:p>
+        </w:tc>
+        <w:tc>
+          <w:tcPr/>
+          <w:p>
+            <w:pPr>
+              <w:pStyle w:val="Compact"/>
+              <w:jc w:val="left"/>
+            </w:pPr>
+            <w:r>
+              <w:t xml:space="preserve">B1 ukf</w:t>
+            </w:r>
+          </w:p>
+        </w:tc>
+        <w:tc>
+          <w:tcPr/>
+          <w:p>
+            <w:pPr>
+              <w:pStyle w:val="Compact"/>
+              <w:jc w:val="left"/>
+            </w:pPr>
+            <w:r>
+              <w:t xml:space="preserve">0.63459</w:t>
+            </w:r>
+          </w:p>
+        </w:tc>
+        <w:tc>
+          <w:tcPr/>
+          <w:p>
+            <w:pPr>
+              <w:pStyle w:val="Compact"/>
+              <w:jc w:val="left"/>
+            </w:pPr>
+            <w:r>
+              <w:t xml:space="preserve">0.0008501</w:t>
+            </w:r>
+          </w:p>
+        </w:tc>
+        <w:tc>
+          <w:tcPr/>
+          <w:p>
+            <w:pPr>
+              <w:pStyle w:val="Compact"/>
+              <w:jc w:val="left"/>
+            </w:pPr>
+            <w:r>
+              <w:t xml:space="preserve">-0.0010082</w:t>
+            </w:r>
+          </w:p>
+        </w:tc>
+        <w:tc>
+          <w:tcPr/>
+          <w:p>
+            <w:pPr>
+              <w:pStyle w:val="Compact"/>
+              <w:jc w:val="left"/>
+            </w:pPr>
+            <w:r>
+              <w:t xml:space="preserve">0.0028354</w:t>
+            </w:r>
+          </w:p>
+        </w:tc>
+        <w:tc>
+          <w:tcPr/>
+          <w:p>
+            <w:pPr>
+              <w:pStyle w:val="Compact"/>
+              <w:jc w:val="left"/>
+            </w:pPr>
+            <w:r>
+              <w:t xml:space="preserve">0.41857</w:t>
             </w:r>
           </w:p>
         </w:tc>
@@ -365,79 +365,79 @@
               <w:jc w:val="left"/>
             </w:pPr>
             <w:r>
-              <w:t xml:space="preserve">P3_adaptive_regret</w:t>
-            </w:r>
-          </w:p>
-        </w:tc>
-        <w:tc>
-          <w:tcPr/>
-          <w:p>
-            <w:pPr>
-              <w:pStyle w:val="Compact"/>
-              <w:jc w:val="left"/>
-            </w:pPr>
-            <w:r>
-              <w:t xml:space="preserve">B2_both</w:t>
-            </w:r>
-          </w:p>
-        </w:tc>
-        <w:tc>
-          <w:tcPr/>
-          <w:p>
-            <w:pPr>
-              <w:pStyle w:val="Compact"/>
-              <w:jc w:val="left"/>
-            </w:pPr>
-            <w:r>
-              <w:t xml:space="preserve">0.657212</w:t>
-            </w:r>
-          </w:p>
-        </w:tc>
-        <w:tc>
-          <w:tcPr/>
-          <w:p>
-            <w:pPr>
-              <w:pStyle w:val="Compact"/>
-              <w:jc w:val="left"/>
-            </w:pPr>
-            <w:r>
-              <w:t xml:space="preserve">0.000578973</w:t>
-            </w:r>
-          </w:p>
-        </w:tc>
-        <w:tc>
-          <w:tcPr/>
-          <w:p>
-            <w:pPr>
-              <w:pStyle w:val="Compact"/>
-              <w:jc w:val="left"/>
-            </w:pPr>
-            <w:r>
-              <w:t xml:space="preserve">-0.000207131</w:t>
-            </w:r>
-          </w:p>
-        </w:tc>
-        <w:tc>
-          <w:tcPr/>
-          <w:p>
-            <w:pPr>
-              <w:pStyle w:val="Compact"/>
-              <w:jc w:val="left"/>
-            </w:pPr>
-            <w:r>
-              <w:t xml:space="preserve">0.00145957</w:t>
-            </w:r>
-          </w:p>
-        </w:tc>
-        <w:tc>
-          <w:tcPr/>
-          <w:p>
-            <w:pPr>
-              <w:pStyle w:val="Compact"/>
-              <w:jc w:val="left"/>
-            </w:pPr>
-            <w:r>
-              <w:t xml:space="preserve">0.418569</w:t>
+              <w:t xml:space="preserve">P3 adaptive regret</w:t>
+            </w:r>
+          </w:p>
+        </w:tc>
+        <w:tc>
+          <w:tcPr/>
+          <w:p>
+            <w:pPr>
+              <w:pStyle w:val="Compact"/>
+              <w:jc w:val="left"/>
+            </w:pPr>
+            <w:r>
+              <w:t xml:space="preserve">B2 both</w:t>
+            </w:r>
+          </w:p>
+        </w:tc>
+        <w:tc>
+          <w:tcPr/>
+          <w:p>
+            <w:pPr>
+              <w:pStyle w:val="Compact"/>
+              <w:jc w:val="left"/>
+            </w:pPr>
+            <w:r>
+              <w:t xml:space="preserve">0.65721</w:t>
+            </w:r>
+          </w:p>
+        </w:tc>
+        <w:tc>
+          <w:tcPr/>
+          <w:p>
+            <w:pPr>
+              <w:pStyle w:val="Compact"/>
+              <w:jc w:val="left"/>
+            </w:pPr>
+            <w:r>
+              <w:t xml:space="preserve">0.00057897</w:t>
+            </w:r>
+          </w:p>
+        </w:tc>
+        <w:tc>
+          <w:tcPr/>
+          <w:p>
+            <w:pPr>
+              <w:pStyle w:val="Compact"/>
+              <w:jc w:val="left"/>
+            </w:pPr>
+            <w:r>
+              <w:t xml:space="preserve">-0.00020713</w:t>
+            </w:r>
+          </w:p>
+        </w:tc>
+        <w:tc>
+          <w:tcPr/>
+          <w:p>
+            <w:pPr>
+              <w:pStyle w:val="Compact"/>
+              <w:jc w:val="left"/>
+            </w:pPr>
+            <w:r>
+              <w:t xml:space="preserve">0.0014596</w:t>
+            </w:r>
+          </w:p>
+        </w:tc>
+        <w:tc>
+          <w:tcPr/>
+          <w:p>
+            <w:pPr>
+              <w:pStyle w:val="Compact"/>
+              <w:jc w:val="left"/>
+            </w:pPr>
+            <w:r>
+              <w:t xml:space="preserve">0.41857</w:t>
             </w:r>
           </w:p>
         </w:tc>
@@ -451,19 +451,19 @@
               <w:jc w:val="left"/>
             </w:pPr>
             <w:r>
-              <w:t xml:space="preserve">B2_both</w:t>
-            </w:r>
-          </w:p>
-        </w:tc>
-        <w:tc>
-          <w:tcPr/>
-          <w:p>
-            <w:pPr>
-              <w:pStyle w:val="Compact"/>
-              <w:jc w:val="left"/>
-            </w:pPr>
-            <w:r>
-              <w:t xml:space="preserve">B2_estimator</w:t>
+              <w:t xml:space="preserve">B2 both</w:t>
+            </w:r>
+          </w:p>
+        </w:tc>
+        <w:tc>
+          <w:tcPr/>
+          <w:p>
+            <w:pPr>
+              <w:pStyle w:val="Compact"/>
+              <w:jc w:val="left"/>
+            </w:pPr>
+            <w:r>
+              <w:t xml:space="preserve">B2 estimator</w:t>
             </w:r>
           </w:p>
         </w:tc>
@@ -487,43 +487,43 @@
               <w:jc w:val="left"/>
             </w:pPr>
             <w:r>
-              <w:t xml:space="preserve">0.0585153</w:t>
-            </w:r>
-          </w:p>
-        </w:tc>
-        <w:tc>
-          <w:tcPr/>
-          <w:p>
-            <w:pPr>
-              <w:pStyle w:val="Compact"/>
-              <w:jc w:val="left"/>
-            </w:pPr>
-            <w:r>
-              <w:t xml:space="preserve">0.0565261</w:t>
-            </w:r>
-          </w:p>
-        </w:tc>
-        <w:tc>
-          <w:tcPr/>
-          <w:p>
-            <w:pPr>
-              <w:pStyle w:val="Compact"/>
-              <w:jc w:val="left"/>
-            </w:pPr>
-            <w:r>
-              <w:t xml:space="preserve">0.0604609</w:t>
-            </w:r>
-          </w:p>
-        </w:tc>
-        <w:tc>
-          <w:tcPr/>
-          <w:p>
-            <w:pPr>
-              <w:pStyle w:val="Compact"/>
-              <w:jc w:val="left"/>
-            </w:pPr>
-            <w:r>
-              <w:t xml:space="preserve">3.11056e-22</w:t>
+              <w:t xml:space="preserve">0.058515</w:t>
+            </w:r>
+          </w:p>
+        </w:tc>
+        <w:tc>
+          <w:tcPr/>
+          <w:p>
+            <w:pPr>
+              <w:pStyle w:val="Compact"/>
+              <w:jc w:val="left"/>
+            </w:pPr>
+            <w:r>
+              <w:t xml:space="preserve">0.056526</w:t>
+            </w:r>
+          </w:p>
+        </w:tc>
+        <w:tc>
+          <w:tcPr/>
+          <w:p>
+            <w:pPr>
+              <w:pStyle w:val="Compact"/>
+              <w:jc w:val="left"/>
+            </w:pPr>
+            <w:r>
+              <w:t xml:space="preserve">0.060461</w:t>
+            </w:r>
+          </w:p>
+        </w:tc>
+        <w:tc>
+          <w:tcPr/>
+          <w:p>
+            <w:pPr>
+              <w:pStyle w:val="Compact"/>
+              <w:jc w:val="left"/>
+            </w:pPr>
+            <w:r>
+              <w:t xml:space="preserve">3.1106e-22</w:t>
             </w:r>
           </w:p>
         </w:tc>
@@ -602,43 +602,43 @@
               <w:jc w:val="left"/>
             </w:pPr>
             <w:r>
-              <w:t xml:space="preserve">candidate</w:t>
-            </w:r>
-          </w:p>
-        </w:tc>
-        <w:tc>
-          <w:tcPr/>
-          <w:p>
-            <w:pPr>
-              <w:pStyle w:val="Compact"/>
-              <w:jc w:val="left"/>
-            </w:pPr>
-            <w:r>
-              <w:t xml:space="preserve">percent_improvement</w:t>
-            </w:r>
-          </w:p>
-        </w:tc>
-        <w:tc>
-          <w:tcPr/>
-          <w:p>
-            <w:pPr>
-              <w:pStyle w:val="Compact"/>
-              <w:jc w:val="left"/>
-            </w:pPr>
-            <w:r>
-              <w:t xml:space="preserve">ci95_low</w:t>
-            </w:r>
-          </w:p>
-        </w:tc>
-        <w:tc>
-          <w:tcPr/>
-          <w:p>
-            <w:pPr>
-              <w:pStyle w:val="Compact"/>
-              <w:jc w:val="left"/>
-            </w:pPr>
-            <w:r>
-              <w:t xml:space="preserve">ci95_high</w:t>
+              <w:t xml:space="preserve">Candidate</w:t>
+            </w:r>
+          </w:p>
+        </w:tc>
+        <w:tc>
+          <w:tcPr/>
+          <w:p>
+            <w:pPr>
+              <w:pStyle w:val="Compact"/>
+              <w:jc w:val="left"/>
+            </w:pPr>
+            <w:r>
+              <w:t xml:space="preserve">Gain (%)</w:t>
+            </w:r>
+          </w:p>
+        </w:tc>
+        <w:tc>
+          <w:tcPr/>
+          <w:p>
+            <w:pPr>
+              <w:pStyle w:val="Compact"/>
+              <w:jc w:val="left"/>
+            </w:pPr>
+            <w:r>
+              <w:t xml:space="preserve">CI lower</w:t>
+            </w:r>
+          </w:p>
+        </w:tc>
+        <w:tc>
+          <w:tcPr/>
+          <w:p>
+            <w:pPr>
+              <w:pStyle w:val="Compact"/>
+              <w:jc w:val="left"/>
+            </w:pPr>
+            <w:r>
+              <w:t xml:space="preserve">CI upper</w:t>
             </w:r>
           </w:p>
         </w:tc>
@@ -652,55 +652,55 @@
               <w:jc w:val="left"/>
             </w:pPr>
             <w:r>
-              <w:t xml:space="preserve">correlated_noise</w:t>
-            </w:r>
-          </w:p>
-        </w:tc>
-        <w:tc>
-          <w:tcPr/>
-          <w:p>
-            <w:pPr>
-              <w:pStyle w:val="Compact"/>
-              <w:jc w:val="left"/>
-            </w:pPr>
-            <w:r>
-              <w:t xml:space="preserve">B0_PI</w:t>
-            </w:r>
-          </w:p>
-        </w:tc>
-        <w:tc>
-          <w:tcPr/>
-          <w:p>
-            <w:pPr>
-              <w:pStyle w:val="Compact"/>
-              <w:jc w:val="left"/>
-            </w:pPr>
-            <w:r>
-              <w:t xml:space="preserve">-592.588</w:t>
-            </w:r>
-          </w:p>
-        </w:tc>
-        <w:tc>
-          <w:tcPr/>
-          <w:p>
-            <w:pPr>
-              <w:pStyle w:val="Compact"/>
-              <w:jc w:val="left"/>
-            </w:pPr>
-            <w:r>
-              <w:t xml:space="preserve">-0.0120465</w:t>
-            </w:r>
-          </w:p>
-        </w:tc>
-        <w:tc>
-          <w:tcPr/>
-          <w:p>
-            <w:pPr>
-              <w:pStyle w:val="Compact"/>
-              <w:jc w:val="left"/>
-            </w:pPr>
-            <w:r>
-              <w:t xml:space="preserve">-0.00900468</w:t>
+              <w:t xml:space="preserve">correlated noise</w:t>
+            </w:r>
+          </w:p>
+        </w:tc>
+        <w:tc>
+          <w:tcPr/>
+          <w:p>
+            <w:pPr>
+              <w:pStyle w:val="Compact"/>
+              <w:jc w:val="left"/>
+            </w:pPr>
+            <w:r>
+              <w:t xml:space="preserve">B0 PI</w:t>
+            </w:r>
+          </w:p>
+        </w:tc>
+        <w:tc>
+          <w:tcPr/>
+          <w:p>
+            <w:pPr>
+              <w:pStyle w:val="Compact"/>
+              <w:jc w:val="left"/>
+            </w:pPr>
+            <w:r>
+              <w:t xml:space="preserve">-592.59</w:t>
+            </w:r>
+          </w:p>
+        </w:tc>
+        <w:tc>
+          <w:tcPr/>
+          <w:p>
+            <w:pPr>
+              <w:pStyle w:val="Compact"/>
+              <w:jc w:val="left"/>
+            </w:pPr>
+            <w:r>
+              <w:t xml:space="preserve">-0.012046</w:t>
+            </w:r>
+          </w:p>
+        </w:tc>
+        <w:tc>
+          <w:tcPr/>
+          <w:p>
+            <w:pPr>
+              <w:pStyle w:val="Compact"/>
+              <w:jc w:val="left"/>
+            </w:pPr>
+            <w:r>
+              <w:t xml:space="preserve">-0.0090047</w:t>
             </w:r>
           </w:p>
         </w:tc>
@@ -726,43 +726,43 @@
               <w:jc w:val="left"/>
             </w:pPr>
             <w:r>
-              <w:t xml:space="preserve">P5_noisy</w:t>
-            </w:r>
-          </w:p>
-        </w:tc>
-        <w:tc>
-          <w:tcPr/>
-          <w:p>
-            <w:pPr>
-              <w:pStyle w:val="Compact"/>
-              <w:jc w:val="left"/>
-            </w:pPr>
-            <w:r>
-              <w:t xml:space="preserve">-453.515</w:t>
-            </w:r>
-          </w:p>
-        </w:tc>
-        <w:tc>
-          <w:tcPr/>
-          <w:p>
-            <w:pPr>
-              <w:pStyle w:val="Compact"/>
-              <w:jc w:val="left"/>
-            </w:pPr>
-            <w:r>
-              <w:t xml:space="preserve">-0.0115612</w:t>
-            </w:r>
-          </w:p>
-        </w:tc>
-        <w:tc>
-          <w:tcPr/>
-          <w:p>
-            <w:pPr>
-              <w:pStyle w:val="Compact"/>
-              <w:jc w:val="left"/>
-            </w:pPr>
-            <w:r>
-              <w:t xml:space="preserve">-0.00356675</w:t>
+              <w:t xml:space="preserve">P5 noisy</w:t>
+            </w:r>
+          </w:p>
+        </w:tc>
+        <w:tc>
+          <w:tcPr/>
+          <w:p>
+            <w:pPr>
+              <w:pStyle w:val="Compact"/>
+              <w:jc w:val="left"/>
+            </w:pPr>
+            <w:r>
+              <w:t xml:space="preserve">-453.52</w:t>
+            </w:r>
+          </w:p>
+        </w:tc>
+        <w:tc>
+          <w:tcPr/>
+          <w:p>
+            <w:pPr>
+              <w:pStyle w:val="Compact"/>
+              <w:jc w:val="left"/>
+            </w:pPr>
+            <w:r>
+              <w:t xml:space="preserve">-0.011561</w:t>
+            </w:r>
+          </w:p>
+        </w:tc>
+        <w:tc>
+          <w:tcPr/>
+          <w:p>
+            <w:pPr>
+              <w:pStyle w:val="Compact"/>
+              <w:jc w:val="left"/>
+            </w:pPr>
+            <w:r>
+              <w:t xml:space="preserve">-0.0035668</w:t>
             </w:r>
           </w:p>
         </w:tc>
@@ -788,43 +788,43 @@
               <w:jc w:val="left"/>
             </w:pPr>
             <w:r>
-              <w:t xml:space="preserve">B2_both</w:t>
-            </w:r>
-          </w:p>
-        </w:tc>
-        <w:tc>
-          <w:tcPr/>
-          <w:p>
-            <w:pPr>
-              <w:pStyle w:val="Compact"/>
-              <w:jc w:val="left"/>
-            </w:pPr>
-            <w:r>
-              <w:t xml:space="preserve">-414.805</w:t>
-            </w:r>
-          </w:p>
-        </w:tc>
-        <w:tc>
-          <w:tcPr/>
-          <w:p>
-            <w:pPr>
-              <w:pStyle w:val="Compact"/>
-              <w:jc w:val="left"/>
-            </w:pPr>
-            <w:r>
-              <w:t xml:space="preserve">-0.00994615</w:t>
-            </w:r>
-          </w:p>
-        </w:tc>
-        <w:tc>
-          <w:tcPr/>
-          <w:p>
-            <w:pPr>
-              <w:pStyle w:val="Compact"/>
-              <w:jc w:val="left"/>
-            </w:pPr>
-            <w:r>
-              <w:t xml:space="preserve">-0.00387001</w:t>
+              <w:t xml:space="preserve">B2 both</w:t>
+            </w:r>
+          </w:p>
+        </w:tc>
+        <w:tc>
+          <w:tcPr/>
+          <w:p>
+            <w:pPr>
+              <w:pStyle w:val="Compact"/>
+              <w:jc w:val="left"/>
+            </w:pPr>
+            <w:r>
+              <w:t xml:space="preserve">-414.81</w:t>
+            </w:r>
+          </w:p>
+        </w:tc>
+        <w:tc>
+          <w:tcPr/>
+          <w:p>
+            <w:pPr>
+              <w:pStyle w:val="Compact"/>
+              <w:jc w:val="left"/>
+            </w:pPr>
+            <w:r>
+              <w:t xml:space="preserve">-0.0099462</w:t>
+            </w:r>
+          </w:p>
+        </w:tc>
+        <w:tc>
+          <w:tcPr/>
+          <w:p>
+            <w:pPr>
+              <w:pStyle w:val="Compact"/>
+              <w:jc w:val="left"/>
+            </w:pPr>
+            <w:r>
+              <w:t xml:space="preserve">-0.00387</w:t>
             </w:r>
           </w:p>
         </w:tc>
@@ -838,55 +838,55 @@
               <w:jc w:val="left"/>
             </w:pPr>
             <w:r>
-              <w:t xml:space="preserve">correlated_noise</w:t>
-            </w:r>
-          </w:p>
-        </w:tc>
-        <w:tc>
-          <w:tcPr/>
-          <w:p>
-            <w:pPr>
-              <w:pStyle w:val="Compact"/>
-              <w:jc w:val="left"/>
-            </w:pPr>
-            <w:r>
-              <w:t xml:space="preserve">B2_both</w:t>
-            </w:r>
-          </w:p>
-        </w:tc>
-        <w:tc>
-          <w:tcPr/>
-          <w:p>
-            <w:pPr>
-              <w:pStyle w:val="Compact"/>
-              <w:jc w:val="left"/>
-            </w:pPr>
-            <w:r>
-              <w:t xml:space="preserve">-398.963</w:t>
-            </w:r>
-          </w:p>
-        </w:tc>
-        <w:tc>
-          <w:tcPr/>
-          <w:p>
-            <w:pPr>
-              <w:pStyle w:val="Compact"/>
-              <w:jc w:val="left"/>
-            </w:pPr>
-            <w:r>
-              <w:t xml:space="preserve">-0.0101161</w:t>
-            </w:r>
-          </w:p>
-        </w:tc>
-        <w:tc>
-          <w:tcPr/>
-          <w:p>
-            <w:pPr>
-              <w:pStyle w:val="Compact"/>
-              <w:jc w:val="left"/>
-            </w:pPr>
-            <w:r>
-              <w:t xml:space="preserve">-0.00404126</w:t>
+              <w:t xml:space="preserve">correlated noise</w:t>
+            </w:r>
+          </w:p>
+        </w:tc>
+        <w:tc>
+          <w:tcPr/>
+          <w:p>
+            <w:pPr>
+              <w:pStyle w:val="Compact"/>
+              <w:jc w:val="left"/>
+            </w:pPr>
+            <w:r>
+              <w:t xml:space="preserve">B2 both</w:t>
+            </w:r>
+          </w:p>
+        </w:tc>
+        <w:tc>
+          <w:tcPr/>
+          <w:p>
+            <w:pPr>
+              <w:pStyle w:val="Compact"/>
+              <w:jc w:val="left"/>
+            </w:pPr>
+            <w:r>
+              <w:t xml:space="preserve">-398.96</w:t>
+            </w:r>
+          </w:p>
+        </w:tc>
+        <w:tc>
+          <w:tcPr/>
+          <w:p>
+            <w:pPr>
+              <w:pStyle w:val="Compact"/>
+              <w:jc w:val="left"/>
+            </w:pPr>
+            <w:r>
+              <w:t xml:space="preserve">-0.010116</w:t>
+            </w:r>
+          </w:p>
+        </w:tc>
+        <w:tc>
+          <w:tcPr/>
+          <w:p>
+            <w:pPr>
+              <w:pStyle w:val="Compact"/>
+              <w:jc w:val="left"/>
+            </w:pPr>
+            <w:r>
+              <w:t xml:space="preserve">-0.0040413</w:t>
             </w:r>
           </w:p>
         </w:tc>
@@ -912,31 +912,31 @@
               <w:jc w:val="left"/>
             </w:pPr>
             <w:r>
-              <w:t xml:space="preserve">P5_noisy</w:t>
-            </w:r>
-          </w:p>
-        </w:tc>
-        <w:tc>
-          <w:tcPr/>
-          <w:p>
-            <w:pPr>
-              <w:pStyle w:val="Compact"/>
-              <w:jc w:val="left"/>
-            </w:pPr>
-            <w:r>
-              <w:t xml:space="preserve">-381.224</w:t>
-            </w:r>
-          </w:p>
-        </w:tc>
-        <w:tc>
-          <w:tcPr/>
-          <w:p>
-            <w:pPr>
-              <w:pStyle w:val="Compact"/>
-              <w:jc w:val="left"/>
-            </w:pPr>
-            <w:r>
-              <w:t xml:space="preserve">-0.00936466</w:t>
+              <w:t xml:space="preserve">P5 noisy</w:t>
+            </w:r>
+          </w:p>
+        </w:tc>
+        <w:tc>
+          <w:tcPr/>
+          <w:p>
+            <w:pPr>
+              <w:pStyle w:val="Compact"/>
+              <w:jc w:val="left"/>
+            </w:pPr>
+            <w:r>
+              <w:t xml:space="preserve">-381.22</w:t>
+            </w:r>
+          </w:p>
+        </w:tc>
+        <w:tc>
+          <w:tcPr/>
+          <w:p>
+            <w:pPr>
+              <w:pStyle w:val="Compact"/>
+              <w:jc w:val="left"/>
+            </w:pPr>
+            <w:r>
+              <w:t xml:space="preserve">-0.0093647</w:t>
             </w:r>
           </w:p>
         </w:tc>
@@ -974,43 +974,43 @@
               <w:jc w:val="left"/>
             </w:pPr>
             <w:r>
-              <w:t xml:space="preserve">P5_noisy</w:t>
-            </w:r>
-          </w:p>
-        </w:tc>
-        <w:tc>
-          <w:tcPr/>
-          <w:p>
-            <w:pPr>
-              <w:pStyle w:val="Compact"/>
-              <w:jc w:val="left"/>
-            </w:pPr>
-            <w:r>
-              <w:t xml:space="preserve">-381.224</w:t>
-            </w:r>
-          </w:p>
-        </w:tc>
-        <w:tc>
-          <w:tcPr/>
-          <w:p>
-            <w:pPr>
-              <w:pStyle w:val="Compact"/>
-              <w:jc w:val="left"/>
-            </w:pPr>
-            <w:r>
-              <w:t xml:space="preserve">-0.00933152</w:t>
-            </w:r>
-          </w:p>
-        </w:tc>
-        <w:tc>
-          <w:tcPr/>
-          <w:p>
-            <w:pPr>
-              <w:pStyle w:val="Compact"/>
-              <w:jc w:val="left"/>
-            </w:pPr>
-            <w:r>
-              <w:t xml:space="preserve">-0.00325644</w:t>
+              <w:t xml:space="preserve">P5 noisy</w:t>
+            </w:r>
+          </w:p>
+        </w:tc>
+        <w:tc>
+          <w:tcPr/>
+          <w:p>
+            <w:pPr>
+              <w:pStyle w:val="Compact"/>
+              <w:jc w:val="left"/>
+            </w:pPr>
+            <w:r>
+              <w:t xml:space="preserve">-381.22</w:t>
+            </w:r>
+          </w:p>
+        </w:tc>
+        <w:tc>
+          <w:tcPr/>
+          <w:p>
+            <w:pPr>
+              <w:pStyle w:val="Compact"/>
+              <w:jc w:val="left"/>
+            </w:pPr>
+            <w:r>
+              <w:t xml:space="preserve">-0.0093315</w:t>
+            </w:r>
+          </w:p>
+        </w:tc>
+        <w:tc>
+          <w:tcPr/>
+          <w:p>
+            <w:pPr>
+              <w:pStyle w:val="Compact"/>
+              <w:jc w:val="left"/>
+            </w:pPr>
+            <w:r>
+              <w:t xml:space="preserve">-0.0032564</w:t>
             </w:r>
           </w:p>
         </w:tc>

</xml_diff>